<commit_message>
docs: add V3 deployment specification
</commit_message>
<xml_diff>
--- a/doc/Informe-V2.docx
+++ b/doc/Informe-V2.docx
@@ -1,6 +1,6 @@
 
 <file path=word/document.xml><?xml version="1.0" encoding="utf-8"?>
-<w:document xmlns:wpc="http://schemas.microsoft.com/office/word/2010/wordprocessingCanvas" xmlns:cx="http://schemas.microsoft.com/office/drawing/2014/chartex" xmlns:cx1="http://schemas.microsoft.com/office/drawing/2015/9/8/chartex" xmlns:cx2="http://schemas.microsoft.com/office/drawing/2015/10/21/chartex" xmlns:cx3="http://schemas.microsoft.com/office/drawing/2016/5/9/chartex" xmlns:cx4="http://schemas.microsoft.com/office/drawing/2016/5/10/chartex" xmlns:cx5="http://schemas.microsoft.com/office/drawing/2016/5/11/chartex" xmlns:cx6="http://schemas.microsoft.com/office/drawing/2016/5/12/chartex" xmlns:cx7="http://schemas.microsoft.com/office/drawing/2016/5/13/chartex" xmlns:cx8="http://schemas.microsoft.com/office/drawing/2016/5/14/chartex" xmlns:mc="http://schemas.openxmlformats.org/markup-compatibility/2006" xmlns:aink="http://schemas.microsoft.com/office/drawing/2016/ink" xmlns:am3d="http://schemas.microsoft.com/office/drawing/2017/model3d" xmlns:o="urn:schemas-microsoft-com:office:office" xmlns:oel="http://schemas.microsoft.com/office/2019/extlst" xmlns:r="http://schemas.openxmlformats.org/officeDocument/2006/relationships" xmlns:m="http://schemas.openxmlformats.org/officeDocument/2006/math" xmlns:v="urn:schemas-microsoft-com:vml" xmlns:wp14="http://schemas.microsoft.com/office/word/2010/wordprocessingDrawing" xmlns:wp="http://schemas.openxmlformats.org/drawingml/2006/wordprocessingDrawing" xmlns:w10="urn:schemas-microsoft-com:office:word" xmlns:w="http://schemas.openxmlformats.org/wordprocessingml/2006/main" xmlns:w14="http://schemas.microsoft.com/office/word/2010/wordml" xmlns:w15="http://schemas.microsoft.com/office/word/2012/wordml" xmlns:w16cex="http://schemas.microsoft.com/office/word/2018/wordml/cex" xmlns:w16cid="http://schemas.microsoft.com/office/word/2016/wordml/cid" xmlns:w16="http://schemas.microsoft.com/office/word/2018/wordml" xmlns:w16du="http://schemas.microsoft.com/office/word/2023/wordml/word16du" xmlns:w16sdtdh="http://schemas.microsoft.com/office/word/2020/wordml/sdtdatahash" xmlns:w16sdtfl="http://schemas.microsoft.com/office/word/2024/wordml/sdtformatlock" xmlns:w16se="http://schemas.microsoft.com/office/word/2015/wordml/symex" xmlns:wpg="http://schemas.microsoft.com/office/word/2010/wordprocessingGroup" xmlns:wpi="http://schemas.microsoft.com/office/word/2010/wordprocessingInk" xmlns:wne="http://schemas.microsoft.com/office/word/2006/wordml" xmlns:wps="http://schemas.microsoft.com/office/word/2010/wordprocessingShape" mc:Ignorable="w14 w15 w16se w16cid w16 w16cex w16sdtdh w16sdtfl w16du wp14">
+<w:document xmlns:ns1="http://schemas.openxmlformats.org/markup-compatibility/2006" xmlns:w="http://schemas.openxmlformats.org/wordprocessingml/2006/main" ns1:Ignorable="w14 w15 w16se w16cid w16 w16cex w16sdtdh w16sdtfl w16du wp14">
   <w:body>
     <w:p>
       <w:pPr>
@@ -2275,6 +2275,399 @@
       </w:r>
     </w:p>
     <w:p>
+      <w:r>
+        <w:rPr>
+          <w:b/>
+        </w:rPr>
+        <w:t xml:space="preserve">Evidencia experimental del punto de distribucion</w:t>
+      </w:r>
+    </w:p>
+    <w:p>
+      <w:r>
+        <w:t xml:space="preserve">Las siguientes mediciones locales soportan la decision de implementar una Version 3 distribuida. La evidencia muestra que la Version 2 mejora el calculo con ThreadPool, pero al crecer el dataset la lectura y el volumen de datos empiezan a dominar el procesamiento.</w:t>
+      </w:r>
+    </w:p>
+    <w:tbl>
+      <w:tblPr>
+        <w:tblStyle w:val="TableGrid"/>
+        <w:tblBorders>
+          <w:top w:val="single" w:sz="4" w:space="0" w:color="auto"/>
+          <w:left w:val="single" w:sz="4" w:space="0" w:color="auto"/>
+          <w:bottom w:val="single" w:sz="4" w:space="0" w:color="auto"/>
+          <w:right w:val="single" w:sz="4" w:space="0" w:color="auto"/>
+          <w:insideH w:val="single" w:sz="4" w:space="0" w:color="auto"/>
+          <w:insideV w:val="single" w:sz="4" w:space="0" w:color="auto"/>
+        </w:tblBorders>
+      </w:tblPr>
+      <w:tr>
+        <w:tc>
+          <w:tcPr>
+            <w:tcW w:w="2200" w:type="dxa"/>
+            <w:shd w:fill="D9EAF7"/>
+          </w:tcPr>
+          <w:p>
+            <w:r>
+              <w:rPr>
+                <w:b/>
+              </w:rPr>
+              <w:t xml:space="preserve">Filas procesadas</w:t>
+            </w:r>
+          </w:p>
+        </w:tc>
+        <w:tc>
+          <w:tcPr>
+            <w:tcW w:w="2200" w:type="dxa"/>
+            <w:shd w:fill="D9EAF7"/>
+          </w:tcPr>
+          <w:p>
+            <w:r>
+              <w:rPr>
+                <w:b/>
+              </w:rPr>
+              <w:t xml:space="preserve">V1 secuencial</w:t>
+            </w:r>
+          </w:p>
+        </w:tc>
+        <w:tc>
+          <w:tcPr>
+            <w:tcW w:w="2200" w:type="dxa"/>
+            <w:shd w:fill="D9EAF7"/>
+          </w:tcPr>
+          <w:p>
+            <w:r>
+              <w:rPr>
+                <w:b/>
+              </w:rPr>
+              <w:t xml:space="preserve">Mejor V2 ThreadPool</w:t>
+            </w:r>
+          </w:p>
+        </w:tc>
+        <w:tc>
+          <w:tcPr>
+            <w:tcW w:w="2200" w:type="dxa"/>
+            <w:shd w:fill="D9EAF7"/>
+          </w:tcPr>
+          <w:p>
+            <w:r>
+              <w:rPr>
+                <w:b/>
+              </w:rPr>
+              <w:t xml:space="preserve">Mejor configuracion V2</w:t>
+            </w:r>
+          </w:p>
+        </w:tc>
+        <w:tc>
+          <w:tcPr>
+            <w:tcW w:w="2200" w:type="dxa"/>
+            <w:shd w:fill="D9EAF7"/>
+          </w:tcPr>
+          <w:p>
+            <w:r>
+              <w:rPr>
+                <w:b/>
+              </w:rPr>
+              <w:t xml:space="preserve">Lectura CSV</w:t>
+            </w:r>
+          </w:p>
+        </w:tc>
+      </w:tr>
+      <w:tr>
+        <w:tc>
+          <w:tcPr>
+            <w:tcW w:w="2200" w:type="dxa"/>
+          </w:tcPr>
+          <w:p>
+            <w:r>
+              <w:t xml:space="preserve">1,000,000</w:t>
+            </w:r>
+          </w:p>
+        </w:tc>
+        <w:tc>
+          <w:tcPr>
+            <w:tcW w:w="2200" w:type="dxa"/>
+          </w:tcPr>
+          <w:p>
+            <w:r>
+              <w:t xml:space="preserve">653 ms</w:t>
+            </w:r>
+          </w:p>
+        </w:tc>
+        <w:tc>
+          <w:tcPr>
+            <w:tcW w:w="2200" w:type="dxa"/>
+          </w:tcPr>
+          <w:p>
+            <w:r>
+              <w:t xml:space="preserve">131 ms</w:t>
+            </w:r>
+          </w:p>
+        </w:tc>
+        <w:tc>
+          <w:tcPr>
+            <w:tcW w:w="2200" w:type="dxa"/>
+          </w:tcPr>
+          <w:p>
+            <w:r>
+              <w:t xml:space="preserve">8 hilos</w:t>
+            </w:r>
+          </w:p>
+        </w:tc>
+        <w:tc>
+          <w:tcPr>
+            <w:tcW w:w="2200" w:type="dxa"/>
+          </w:tcPr>
+          <w:p>
+            <w:r>
+              <w:t xml:space="preserve">1,025 ms</w:t>
+            </w:r>
+          </w:p>
+        </w:tc>
+      </w:tr>
+      <w:tr>
+        <w:tc>
+          <w:tcPr>
+            <w:tcW w:w="2200" w:type="dxa"/>
+          </w:tcPr>
+          <w:p>
+            <w:r>
+              <w:t xml:space="preserve">5,000,000</w:t>
+            </w:r>
+          </w:p>
+        </w:tc>
+        <w:tc>
+          <w:tcPr>
+            <w:tcW w:w="2200" w:type="dxa"/>
+          </w:tcPr>
+          <w:p>
+            <w:r>
+              <w:t xml:space="preserve">2,860 ms</w:t>
+            </w:r>
+          </w:p>
+        </w:tc>
+        <w:tc>
+          <w:tcPr>
+            <w:tcW w:w="2200" w:type="dxa"/>
+          </w:tcPr>
+          <w:p>
+            <w:r>
+              <w:t xml:space="preserve">857 ms</w:t>
+            </w:r>
+          </w:p>
+        </w:tc>
+        <w:tc>
+          <w:tcPr>
+            <w:tcW w:w="2200" w:type="dxa"/>
+          </w:tcPr>
+          <w:p>
+            <w:r>
+              <w:t xml:space="preserve">12 hilos</w:t>
+            </w:r>
+          </w:p>
+        </w:tc>
+        <w:tc>
+          <w:tcPr>
+            <w:tcW w:w="2200" w:type="dxa"/>
+          </w:tcPr>
+          <w:p>
+            <w:r>
+              <w:t xml:space="preserve">4,560 ms</w:t>
+            </w:r>
+          </w:p>
+        </w:tc>
+      </w:tr>
+      <w:tr>
+        <w:tc>
+          <w:tcPr>
+            <w:tcW w:w="2200" w:type="dxa"/>
+          </w:tcPr>
+          <w:p>
+            <w:r>
+              <w:t xml:space="preserve">10,000,000</w:t>
+            </w:r>
+          </w:p>
+        </w:tc>
+        <w:tc>
+          <w:tcPr>
+            <w:tcW w:w="2200" w:type="dxa"/>
+          </w:tcPr>
+          <w:p>
+            <w:r>
+              <w:t xml:space="preserve">5,872 ms</w:t>
+            </w:r>
+          </w:p>
+        </w:tc>
+        <w:tc>
+          <w:tcPr>
+            <w:tcW w:w="2200" w:type="dxa"/>
+          </w:tcPr>
+          <w:p>
+            <w:r>
+              <w:t xml:space="preserve">1,434 ms</w:t>
+            </w:r>
+          </w:p>
+        </w:tc>
+        <w:tc>
+          <w:tcPr>
+            <w:tcW w:w="2200" w:type="dxa"/>
+          </w:tcPr>
+          <w:p>
+            <w:r>
+              <w:t xml:space="preserve">12 hilos</w:t>
+            </w:r>
+          </w:p>
+        </w:tc>
+        <w:tc>
+          <w:tcPr>
+            <w:tcW w:w="2200" w:type="dxa"/>
+          </w:tcPr>
+          <w:p>
+            <w:r>
+              <w:t xml:space="preserve">8,335 ms</w:t>
+            </w:r>
+          </w:p>
+        </w:tc>
+      </w:tr>
+    </w:tbl>
+    <w:p>
+      <w:r>
+        <w:rPr>
+          <w:b/>
+        </w:rPr>
+        <w:t xml:space="preserve">Criterio cuantitativo para pasar a Version 3 distribuida</w:t>
+      </w:r>
+    </w:p>
+    <w:tbl>
+      <w:tblPr>
+        <w:tblStyle w:val="TableGrid"/>
+        <w:tblBorders>
+          <w:top w:val="single" w:sz="4" w:space="0" w:color="auto"/>
+          <w:left w:val="single" w:sz="4" w:space="0" w:color="auto"/>
+          <w:bottom w:val="single" w:sz="4" w:space="0" w:color="auto"/>
+          <w:right w:val="single" w:sz="4" w:space="0" w:color="auto"/>
+          <w:insideH w:val="single" w:sz="4" w:space="0" w:color="auto"/>
+          <w:insideV w:val="single" w:sz="4" w:space="0" w:color="auto"/>
+        </w:tblBorders>
+      </w:tblPr>
+      <w:tr>
+        <w:tc>
+          <w:tcPr>
+            <w:tcW w:w="2200" w:type="dxa"/>
+            <w:shd w:fill="D9EAF7"/>
+          </w:tcPr>
+          <w:p>
+            <w:r>
+              <w:rPr>
+                <w:b/>
+              </w:rPr>
+              <w:t xml:space="preserve">Criterio observado</w:t>
+            </w:r>
+          </w:p>
+        </w:tc>
+        <w:tc>
+          <w:tcPr>
+            <w:tcW w:w="2200" w:type="dxa"/>
+            <w:shd w:fill="D9EAF7"/>
+          </w:tcPr>
+          <w:p>
+            <w:r>
+              <w:rPr>
+                <w:b/>
+              </w:rPr>
+              <w:t xml:space="preserve">Interpretacion arquitectonica</w:t>
+            </w:r>
+          </w:p>
+        </w:tc>
+      </w:tr>
+      <w:tr>
+        <w:tc>
+          <w:tcPr>
+            <w:tcW w:w="2200" w:type="dxa"/>
+          </w:tcPr>
+          <w:p>
+            <w:r>
+              <w:t xml:space="preserve">Hasta 1M de datagramas</w:t>
+            </w:r>
+          </w:p>
+        </w:tc>
+        <w:tc>
+          <w:tcPr>
+            <w:tcW w:w="2200" w:type="dxa"/>
+          </w:tcPr>
+          <w:p>
+            <w:r>
+              <w:t xml:space="preserve">V2 con ThreadPool es suficiente; distribuir agregaria sobrecosto de red y coordinacion.</w:t>
+            </w:r>
+          </w:p>
+        </w:tc>
+      </w:tr>
+      <w:tr>
+        <w:tc>
+          <w:tcPr>
+            <w:tcW w:w="2200" w:type="dxa"/>
+          </w:tcPr>
+          <w:p>
+            <w:r>
+              <w:t xml:space="preserve">Desde 5M a 10M de datagramas</w:t>
+            </w:r>
+          </w:p>
+        </w:tc>
+        <w:tc>
+          <w:tcPr>
+            <w:tcW w:w="2200" w:type="dxa"/>
+          </w:tcPr>
+          <w:p>
+            <w:r>
+              <w:t xml:space="preserve">Aparecen senales de saturacion local y el I/O empieza a pesar mas que el calculo.</w:t>
+            </w:r>
+          </w:p>
+        </w:tc>
+      </w:tr>
+      <w:tr>
+        <w:tc>
+          <w:tcPr>
+            <w:tcW w:w="2200" w:type="dxa"/>
+          </w:tcPr>
+          <w:p>
+            <w:r>
+              <w:t xml:space="preserve">Archivo completo datagrams4Pilot.csv: 71.46 GB</w:t>
+            </w:r>
+          </w:p>
+        </w:tc>
+        <w:tc>
+          <w:tcPr>
+            <w:tcW w:w="2200" w:type="dxa"/>
+          </w:tcPr>
+          <w:p>
+            <w:r>
+              <w:t xml:space="preserve">No es razonable cargar todo en memoria local; se justifica particionar y procesar en varios nodos.</w:t>
+            </w:r>
+          </w:p>
+        </w:tc>
+      </w:tr>
+      <w:tr>
+        <w:tc>
+          <w:tcPr>
+            <w:tcW w:w="2200" w:type="dxa"/>
+          </w:tcPr>
+          <w:p>
+            <w:r>
+              <w:t xml:space="preserve">Umbral propuesto: mas de 10M de datagramas</w:t>
+            </w:r>
+          </w:p>
+        </w:tc>
+        <w:tc>
+          <w:tcPr>
+            <w:tcW w:w="2200" w:type="dxa"/>
+          </w:tcPr>
+          <w:p>
+            <w:r>
+              <w:t xml:space="preserve">A partir de este punto se activa la Version 3 distribuida para mejorar escalabilidad y uso de memoria.</w:t>
+            </w:r>
+          </w:p>
+        </w:tc>
+      </w:tr>
+    </w:tbl>
+    <w:p>
       <w:pPr>
         <w:spacing w:before="240" w:after="0" w:line="480" w:lineRule="auto"/>
       </w:pPr>
@@ -2313,6 +2706,11 @@
           <w:szCs w:val="24"/>
         </w:rPr>
         <w:t xml:space="preserve">La implementacion concurrente evita condiciones de carrera porque cada worker opera sobre sus propias particiones y estadisticas parciales. La fusion de resultados ocurre posteriormente en el hilo principal, lo que mantiene el diseno simple y verificable.</w:t>
+      </w:r>
+    </w:p>
+    <w:p>
+      <w:r>
+        <w:t xml:space="preserve">Sobre el punto en el que es necesario distribuir, las mediciones realizadas muestran que la Version 2 con ThreadPool es suficiente para muestras pequenas y medianas, pero empieza a perder conveniencia cuando el volumen supera aproximadamente 10 millones de datagramas o cuando el archivo no puede cargarse completo en memoria local. En particular, el archivo datagrams4Pilot.csv disponible pesa cerca de 71.46 GB, por lo que la Version 3 distribuida se justifica por escalabilidad, uso de memoria y reduccion del tiempo total de procesamiento mediante varios nodos.</w:t>
       </w:r>
     </w:p>
     <w:p>

</xml_diff>